<commit_message>
Add provider workspace and workbook imports
</commit_message>
<xml_diff>
--- a/reports/Product Requirements Document - Development Ready - Updated.docx
+++ b/reports/Product Requirements Document - Development Ready - Updated.docx
@@ -2375,7 +2375,7 @@
               <w:spacing w:after="0"/>
             </w:pPr>
             <w:r>
-              <w:t>Own-organization draft entry, scalar/grid snapshots, validation, allowed private uploads, provider correction/resubmission and technical support.</w:t>
+              <w:t>Shared own-organization work queue, draft scalar/grid snapshots, optimistic autosave/manual save, targeted provider correction/resubmission, read-only compliance details and technical support history.</w:t>
             </w:r>
           </w:p>
         </w:tc>
@@ -2388,7 +2388,7 @@
               <w:spacing w:after="0"/>
             </w:pPr>
             <w:r>
-              <w:t>Cannot officially submit to NCA, see another provider, or use compliance/general contact actions.</w:t>
+              <w:t>Cannot edit Approver/NCA-owned stages, officially submit to NCA, see another provider, or use compliance/general contact actions.</w:t>
             </w:r>
           </w:p>
         </w:tc>
@@ -2416,7 +2416,7 @@
               <w:spacing w:after="0"/>
             </w:pPr>
             <w:r>
-              <w:t>Own-organization approver queue, complete review, targeted provider corrections, official submission, compliance contact and technical support.</w:t>
+              <w:t>Server-calculated approval/NCA-correction queues; exact-version review; permitted field/grid/private-file editing; targeted returns; attested official submission; receipts, compliance contact and technical support.</w:t>
             </w:r>
           </w:p>
         </w:tc>
@@ -2429,7 +2429,7 @@
               <w:spacing w:after="0"/>
             </w:pPr>
             <w:r>
-              <w:t>Cannot perform NCA review, internal exports, user administration or cross-provider access.</w:t>
+              <w:t>Cannot edit ordinary Data Entry drafts, perform NCA review, access internal exports/user administration or cross-provider records.</w:t>
             </w:r>
           </w:p>
         </w:tc>
@@ -3715,7 +3715,7 @@
         <w:spacing w:before="0" w:after="80" w:line="280" w:lineRule="auto"/>
       </w:pPr>
       <w:r>
-        <w:t>Provider Approvers review tenant-isolated drafts, complete values, validation, explanations and clean allowed files before official submission.</w:t>
+        <w:t>Provider Approvers use a server-counted, paginated tenant queue. They cannot edit ordinary drafts, but may edit values/grids/uploads in Pending Provider Approval, Provider Resubmitted and the cloned NCA Correction Requested version. Every Approver save creates an immutable before/after batch and non-sensitive audit hash.</w:t>
       </w:r>
     </w:p>
     <w:p>
@@ -3724,7 +3724,7 @@
         <w:spacing w:before="0" w:after="80" w:line="280" w:lineRule="auto"/>
       </w:pPr>
       <w:r>
-        <w:t>Approvers can request a targeted provider correction with reason and section/field/grid-cell targets, or approve after a fresh readiness check. Returned drafts preserve decision history and resubmission count.</w:t>
+        <w:t>Approvers can request multiple targeted section/field/grid-cell corrections with required instructions, or approve after a fresh readiness/upload/correction check. Official submission requires an accuracy attestation and, after any Approver edit, a required change summary.</w:t>
       </w:r>
     </w:p>
     <w:p>
@@ -4186,7 +4186,7 @@
               <w:spacing w:after="0"/>
             </w:pPr>
             <w:r>
-              <w:t>Provider and regulatory stages are explicit. Official provider and NCA versions are immutable; regulatory correction creates a cloned version and locks unaffected content.</w:t>
+              <w:t>Provider and regulatory stages are explicit. Provider Data Entry edits DRAFT/PROVIDER_CHANGES_REQUESTED; Provider Approver edits PENDING_APPROVAL/PROVIDER_RESUBMITTED and the cloned CORRECTION_REQUESTED version. Official provider and NCA versions are immutable.</w:t>
             </w:r>
           </w:p>
         </w:tc>
@@ -6218,6 +6218,47 @@
             </w:pPr>
             <w:r>
               <w:t>submission_id, requirement, storage reference, SHA-256, scan status/result, uploader, timestamps</w:t>
+            </w:r>
+          </w:p>
+        </w:tc>
+      </w:tr>
+      <w:tr>
+        <w:tc>
+          <w:tcPr>
+            <w:tcW w:type="dxa" w:w="3120"/>
+          </w:tcPr>
+          <w:p>
+            <w:pPr>
+              <w:spacing w:after="0"/>
+            </w:pPr>
+            <w:r>
+              <w:t>ProviderEditBatch / ProviderApprovalDecision</w:t>
+            </w:r>
+          </w:p>
+        </w:tc>
+        <w:tc>
+          <w:tcPr>
+            <w:tcW w:type="dxa" w:w="3120"/>
+          </w:tcPr>
+          <w:p>
+            <w:pPr>
+              <w:spacing w:after="0"/>
+            </w:pPr>
+            <w:r>
+              <w:t>Immutable sensitive before/after provider edit evidence plus official approval attestation.</w:t>
+            </w:r>
+          </w:p>
+        </w:tc>
+        <w:tc>
+          <w:tcPr>
+            <w:tcW w:type="dxa" w:w="3120"/>
+          </w:tcPr>
+          <w:p>
+            <w:pPr>
+              <w:spacing w:after="0"/>
+            </w:pPr>
+            <w:r>
+              <w:t>submission_id, actor, stage, revision, section/target, before/after values, change hash/count, attestation, required change summary, approval note and timestamp</w:t>
             </w:r>
           </w:p>
         </w:tc>
@@ -12196,7 +12237,15 @@
         <w:pStyle w:val="ListBullet"/>
       </w:pPr>
       <w:r>
-        <w:t>Section saves are transactional authoritative snapshots with optimistic revision checks, exact scalar/grid targets, fixed-row preservation and omitted editable-repeatable-row deletion.</w:t>
+        <w:t>Provider workspaces use provider-scoped server summaries and paginated/filterable queues, so counts and actions are not derived from the first browser page. History records the actual submitted timestamp, latest editor/time, correction count and receipt availability.</w:t>
+      </w:r>
+    </w:p>
+    <w:p>
+      <w:pPr>
+        <w:pStyle w:val="ListBullet"/>
+      </w:pPr>
+      <w:r>
+        <w:t>Section saves are transactional authoritative snapshots with debounced autosave, save-on-blur/manual save, optimistic revision checks, exact scalar/grid targets, fixed-row preservation and omitted editable-repeatable-row deletion. Conflicts retain unsaved browser values and identify the latest editor/time.</w:t>
       </w:r>
     </w:p>
     <w:p>
@@ -12212,7 +12261,15 @@
         <w:pStyle w:val="ListBullet"/>
       </w:pPr>
       <w:r>
-        <w:t>Provider and NCA correction instructions require reasons and section/field/grid-cell targets. Regulatory correction clones the official version and locks unaffected content.</w:t>
+        <w:t>Provider and NCA correction instructions require reasons and one or more section/field/grid-cell targets. Regulatory correction clones the official version, belongs initially to the Provider Approver and locks unaffected content. The Approver can correct directly or return targeted work to Data Entry.</w:t>
+      </w:r>
+    </w:p>
+    <w:p>
+      <w:pPr>
+        <w:pStyle w:val="ListBullet"/>
+      </w:pPr>
+      <w:r>
+        <w:t>Approver edits produce immutable sensitive before/after batches visible only to the same provider and privileged NCA staff. The general audit stores target identifiers, counts and SHA-256 digests, not duplicate raw values. Official submission stores attestation, decision, Approver and conditionally required change summary.</w:t>
       </w:r>
     </w:p>
     <w:p>
@@ -12285,6 +12342,14 @@
       </w:pPr>
       <w:r>
         <w:t>Submission notifications are separate from Data Request notifications and are visible only to intended users; timeline audiences prevent internal NCA notes from leaking to providers.</w:t>
+      </w:r>
+    </w:p>
+    <w:p>
+      <w:pPr>
+        <w:pStyle w:val="ListBullet"/>
+      </w:pPr>
+      <w:r>
+        <w:t>Provider navigation shows server-calculated unread and pending-approval counts. Notification links open the relevant provider return, and users can mark one or all read. Technical-support users can view their own ticket status, SLA, resolution and event history.</w:t>
       </w:r>
     </w:p>
     <w:p>

</xml_diff>